<commit_message>
docs(w5): update AI SQL to ORM submission docx and screenshot
</commit_message>
<xml_diff>
--- a/SQL to ORM Refactoring and Security Analysis/Yonas_AI_SQL_to_ORM_Refactoring_and_Security_Analysis.docx
+++ b/SQL to ORM Refactoring and Security Analysis/Yonas_AI_SQL_to_ORM_Refactoring_and_Security_Analysis.docx
@@ -120,7 +120,7 @@
       <w:r>
         <w:drawing>
           <wp:inline xmlns:a="http://schemas.openxmlformats.org/drawingml/2006/main" xmlns:pic="http://schemas.openxmlformats.org/drawingml/2006/picture">
-            <wp:extent cx="5669280" cy="12519660"/>
+            <wp:extent cx="5669280" cy="5533454"/>
             <wp:docPr id="1" name="Picture 1"/>
             <wp:cNvGraphicFramePr>
               <a:graphicFrameLocks noChangeAspect="1"/>
@@ -141,7 +141,7 @@
                   <pic:spPr>
                     <a:xfrm>
                       <a:off x="0" y="0"/>
-                      <a:ext cx="5669280" cy="12519660"/>
+                      <a:ext cx="5669280" cy="5533454"/>
                     </a:xfrm>
                     <a:prstGeom prst="rect"/>
                   </pic:spPr>
@@ -267,7 +267,7 @@
           <w:color w:val="2563EB"/>
           <w:u w:val="single"/>
         </w:rPr>
-        <w:t>https://github.com/yonasleykun27/set-high_level_programming</w:t>
+        <w:t>https://github.com/yonasleykun27/Artificial-Intelligence-in-Software-Engineering</w:t>
       </w:r>
     </w:p>
     <w:p>
@@ -285,7 +285,7 @@
           <w:color w:val="2563EB"/>
           <w:u w:val="single"/>
         </w:rPr>
-        <w:t>https://github.com/yonasleykun27/set-high_level_programming/tree/main/AI_SQL_to_ORM_Refactoring_and_Security_Analysis</w:t>
+        <w:t>https://github.com/yonasleykun27/Artificial-Intelligence-in-Software-Engineering/tree/main/SQL%20to%20ORM%20Refactoring%20and%20Security%20Analysis</w:t>
       </w:r>
     </w:p>
     <w:sectPr>

</xml_diff>